<commit_message>
Deploy update and typo fixes
</commit_message>
<xml_diff>
--- a/InstruccionesDAC.docx
+++ b/InstruccionesDAC.docx
@@ -358,10 +358,7 @@
       </w:r>
       <w:proofErr w:type="spellEnd"/>
       <w:r>
-        <w:t xml:space="preserve">: </w:t>
-      </w:r>
-      <w:r>
-        <w:t>(</w:t>
+        <w:t>: (</w:t>
       </w:r>
       <w:proofErr w:type="spellStart"/>
       <w:r>
@@ -609,7 +606,15 @@
       </w:r>
       <w:proofErr w:type="spellEnd"/>
       <w:r>
-        <w:t xml:space="preserve"> en la maquina de </w:t>
+        <w:t xml:space="preserve"> en la </w:t>
+      </w:r>
+      <w:proofErr w:type="spellStart"/>
+      <w:r>
+        <w:t>maquina</w:t>
+      </w:r>
+      <w:proofErr w:type="spellEnd"/>
+      <w:r>
+        <w:t xml:space="preserve"> de </w:t>
       </w:r>
       <w:proofErr w:type="spellStart"/>
       <w:r>
@@ -1099,74 +1104,12 @@
       <w:proofErr w:type="spellEnd"/>
     </w:p>
     <w:p>
-      <w:r>
-        <w:t xml:space="preserve">    </w:t>
-      </w:r>
-      <w:proofErr w:type="spellStart"/>
-      <w:r>
-        <w:t>environment</w:t>
-      </w:r>
-      <w:proofErr w:type="spellEnd"/>
-      <w:r>
-        <w:t>:</w:t>
-      </w:r>
-    </w:p>
-    <w:p>
-      <w:r>
-        <w:t xml:space="preserve">      </w:t>
-      </w:r>
-      <w:proofErr w:type="spellStart"/>
-      <w:r>
-        <w:t>name</w:t>
-      </w:r>
-      <w:proofErr w:type="spellEnd"/>
-      <w:r>
-        <w:t xml:space="preserve">: </w:t>
-      </w:r>
-      <w:proofErr w:type="spellStart"/>
-      <w:r>
-        <w:t>github-pages</w:t>
-      </w:r>
-      <w:proofErr w:type="spellEnd"/>
-    </w:p>
-    <w:p>
-      <w:r>
-        <w:t xml:space="preserve">      url: $</w:t>
-      </w:r>
-      <w:proofErr w:type="gramStart"/>
-      <w:r>
-        <w:t xml:space="preserve">{{ </w:t>
-      </w:r>
-      <w:proofErr w:type="spellStart"/>
-      <w:r>
-        <w:t>steps</w:t>
-      </w:r>
-      <w:proofErr w:type="gramEnd"/>
-      <w:r>
-        <w:t>.</w:t>
-      </w:r>
-      <w:proofErr w:type="gramStart"/>
-      <w:r>
-        <w:t>deployment.outputs</w:t>
-      </w:r>
-      <w:proofErr w:type="gramEnd"/>
-      <w:r>
-        <w:t>.page_</w:t>
-      </w:r>
-      <w:proofErr w:type="gramStart"/>
-      <w:r>
-        <w:t>url</w:t>
-      </w:r>
-      <w:proofErr w:type="spellEnd"/>
-      <w:r>
-        <w:t xml:space="preserve"> }</w:t>
-      </w:r>
-      <w:proofErr w:type="gramEnd"/>
-      <w:r>
-        <w:t>}</w:t>
-      </w:r>
-    </w:p>
-    <w:p/>
+      <w:pPr>
+        <w:rPr>
+          <w:u w:val="single"/>
+        </w:rPr>
+      </w:pPr>
+    </w:p>
     <w:p>
       <w:r>
         <w:t xml:space="preserve">    </w:t>
@@ -1393,7 +1336,6 @@
     </w:p>
     <w:p>
       <w:r>
-        <w:lastRenderedPageBreak/>
         <w:t>Cómo la creamos mediante HTML en la configuración del YAML.</w:t>
       </w:r>
     </w:p>

</xml_diff>